<commit_message>
docs: finalize all 11 phase-wise documents for iMovies with timeline dates, custom diagrams, and UAT layout fixes
</commit_message>
<xml_diff>
--- a/phase wise documents/Ideation Phase-(1)/Ideation Phase/Define the Problem Statements (2).docx
+++ b/phase wise documents/Ideation Phase-(1)/Ideation Phase/Define the Problem Statements (2).docx
@@ -129,7 +129,7 @@
                 <w:rFonts w:ascii="Calibri" w:cs="Calibri" w:eastAsia="Calibri" w:hAnsi="Calibri"/>
                 <w:rtl w:val="0"/>
               </w:rPr>
-              <w:t xml:space="preserve">31 January 2025</w:t>
+              <w:t xml:space="preserve">08 October 2026</w:t>
             </w:r>
           </w:p>
         </w:tc>
@@ -162,12 +162,19 @@
             <w:pPr>
               <w:rPr>
                 <w:rFonts w:ascii="Calibri" w:cs="Calibri" w:eastAsia="Calibri" w:hAnsi="Calibri"/>
-              </w:rPr>
-            </w:pPr>
-            <w:r>
-              <w:rPr>
-                <w:rtl w:val="0"/>
-              </w:rPr>
+                <w:b w:val="1"/>
+                <w:sz w:val="22"/>
+                <w:szCs w:val="22"/>
+              </w:rPr>
+            </w:pPr>
+            <w:r>
+              <w:rPr>
+                <w:rFonts w:ascii="Calibri" w:cs="Calibri" w:eastAsia="Calibri" w:hAnsi="Calibri"/>
+                <w:b w:val="1"/>
+                <w:sz w:val="22"/>
+                <w:szCs w:val="22"/>
+              </w:rPr>
+              <w:t xml:space="preserve">SWUID2026235621</w:t>
             </w:r>
           </w:p>
         </w:tc>
@@ -200,28 +207,19 @@
             <w:pPr>
               <w:rPr>
                 <w:rFonts w:ascii="Calibri" w:cs="Calibri" w:eastAsia="Calibri" w:hAnsi="Calibri"/>
-              </w:rPr>
-            </w:pPr>
-            <w:r>
-              <w:rPr>
-                <w:rFonts w:ascii="Calibri" w:cs="Calibri" w:eastAsia="Calibri" w:hAnsi="Calibri"/>
-                <w:rtl w:val="0"/>
-              </w:rPr>
-              <w:t xml:space="preserve">Free</w:t>
-            </w:r>
-          </w:p>
-          <w:p>
-            <w:pPr>
-              <w:rPr>
-                <w:rFonts w:ascii="Calibri" w:cs="Calibri" w:eastAsia="Calibri" w:hAnsi="Calibri"/>
-              </w:rPr>
-            </w:pPr>
-            <w:r>
-              <w:rPr>
-                <w:rFonts w:ascii="Calibri" w:cs="Calibri" w:eastAsia="Calibri" w:hAnsi="Calibri"/>
-                <w:rtl w:val="0"/>
-              </w:rPr>
-              <w:t xml:space="preserve">lance finder</w:t>
+                <w:b w:val="1"/>
+                <w:sz w:val="22"/>
+                <w:szCs w:val="22"/>
+              </w:rPr>
+            </w:pPr>
+            <w:r>
+              <w:rPr>
+                <w:rFonts w:ascii="Calibri" w:cs="Calibri" w:eastAsia="Calibri" w:hAnsi="Calibri"/>
+                <w:b w:val="1"/>
+                <w:sz w:val="22"/>
+                <w:szCs w:val="22"/>
+              </w:rPr>
+              <w:t xml:space="preserve">iMovies - Cinema Booking Platform</w:t>
             </w:r>
           </w:p>
         </w:tc>
@@ -324,7 +322,7 @@
           <w:szCs w:val="24"/>
           <w:rtl w:val="0"/>
         </w:rPr>
-        <w:t xml:space="preserve"> To define the core problems freelancers face while searching for jobs online, and use those insights to guide the development of Freelance Finder.</w:t>
+        <w:t xml:space="preserve"> To define the primary challenges and emotional frustrations moviegoers encounter when discovering films, selecting preferred seats in real-time, and completing bookings online, and to use these verified user insights to guide the technical design of the iMovies platform.</w:t>
       </w:r>
     </w:p>
     <w:p>
@@ -683,91 +681,91 @@
                 <w:szCs w:val="24"/>
                 <w:rtl w:val="0"/>
               </w:rPr>
-              <w:t xml:space="preserve">freelance web developer.</w:t>
-            </w:r>
-          </w:p>
-        </w:tc>
-        <w:tc>
-          <w:tcPr/>
-          <w:p>
-            <w:pPr>
-              <w:rPr>
-                <w:rFonts w:ascii="Calibri" w:cs="Calibri" w:eastAsia="Calibri" w:hAnsi="Calibri"/>
-                <w:sz w:val="24"/>
-                <w:szCs w:val="24"/>
-              </w:rPr>
-            </w:pPr>
-            <w:r>
-              <w:rPr>
-                <w:rFonts w:ascii="Calibri" w:cs="Calibri" w:eastAsia="Calibri" w:hAnsi="Calibri"/>
-                <w:sz w:val="24"/>
-                <w:szCs w:val="24"/>
-                <w:rtl w:val="0"/>
-              </w:rPr>
-              <w:t xml:space="preserve">land steady projects</w:t>
-            </w:r>
-          </w:p>
-        </w:tc>
-        <w:tc>
-          <w:tcPr/>
-          <w:p>
-            <w:pPr>
-              <w:rPr>
-                <w:rFonts w:ascii="Calibri" w:cs="Calibri" w:eastAsia="Calibri" w:hAnsi="Calibri"/>
-                <w:sz w:val="24"/>
-                <w:szCs w:val="24"/>
-              </w:rPr>
-            </w:pPr>
-            <w:r>
-              <w:rPr>
-                <w:rFonts w:ascii="Calibri" w:cs="Calibri" w:eastAsia="Calibri" w:hAnsi="Calibri"/>
-                <w:sz w:val="24"/>
-                <w:szCs w:val="24"/>
-                <w:rtl w:val="0"/>
-              </w:rPr>
-              <w:t xml:space="preserve">competition mainstream platforms is overwhelming </w:t>
-            </w:r>
-          </w:p>
-        </w:tc>
-        <w:tc>
-          <w:tcPr/>
-          <w:p>
-            <w:pPr>
-              <w:rPr>
-                <w:rFonts w:ascii="Calibri" w:cs="Calibri" w:eastAsia="Calibri" w:hAnsi="Calibri"/>
-                <w:sz w:val="24"/>
-                <w:szCs w:val="24"/>
-              </w:rPr>
-            </w:pPr>
-            <w:r>
-              <w:rPr>
-                <w:rFonts w:ascii="Calibri" w:cs="Calibri" w:eastAsia="Calibri" w:hAnsi="Calibri"/>
-                <w:sz w:val="24"/>
-                <w:szCs w:val="24"/>
-                <w:rtl w:val="0"/>
-              </w:rPr>
-              <w:t xml:space="preserve"> many clients opt for the cheapest bid</w:t>
-            </w:r>
-          </w:p>
-        </w:tc>
-        <w:tc>
-          <w:tcPr/>
-          <w:p>
-            <w:pPr>
-              <w:rPr>
-                <w:rFonts w:ascii="Calibri" w:cs="Calibri" w:eastAsia="Calibri" w:hAnsi="Calibri"/>
-                <w:sz w:val="24"/>
-                <w:szCs w:val="24"/>
-              </w:rPr>
-            </w:pPr>
-            <w:r>
-              <w:rPr>
-                <w:rFonts w:ascii="Calibri" w:cs="Calibri" w:eastAsia="Calibri" w:hAnsi="Calibri"/>
-                <w:sz w:val="24"/>
-                <w:szCs w:val="24"/>
-                <w:rtl w:val="0"/>
-              </w:rPr>
-              <w:t xml:space="preserve">frustrated and demotivated.</w:t>
+              <w:t xml:space="preserve">College student and weekend moviegoer.</w:t>
+            </w:r>
+          </w:p>
+        </w:tc>
+        <w:tc>
+          <w:tcPr/>
+          <w:p>
+            <w:pPr>
+              <w:rPr>
+                <w:rFonts w:ascii="Calibri" w:cs="Calibri" w:eastAsia="Calibri" w:hAnsi="Calibri"/>
+                <w:sz w:val="24"/>
+                <w:szCs w:val="24"/>
+              </w:rPr>
+            </w:pPr>
+            <w:r>
+              <w:rPr>
+                <w:rFonts w:ascii="Calibri" w:cs="Calibri" w:eastAsia="Calibri" w:hAnsi="Calibri"/>
+                <w:sz w:val="24"/>
+                <w:szCs w:val="24"/>
+                <w:rtl w:val="0"/>
+              </w:rPr>
+              <w:t xml:space="preserve">reserve prime weekend cinema tickets together with friends for blockbuster releases</w:t>
+            </w:r>
+          </w:p>
+        </w:tc>
+        <w:tc>
+          <w:tcPr/>
+          <w:p>
+            <w:pPr>
+              <w:rPr>
+                <w:rFonts w:ascii="Calibri" w:cs="Calibri" w:eastAsia="Calibri" w:hAnsi="Calibri"/>
+                <w:sz w:val="24"/>
+                <w:szCs w:val="24"/>
+              </w:rPr>
+            </w:pPr>
+            <w:r>
+              <w:rPr>
+                <w:rFonts w:ascii="Calibri" w:cs="Calibri" w:eastAsia="Calibri" w:hAnsi="Calibri"/>
+                <w:sz w:val="24"/>
+                <w:szCs w:val="24"/>
+                <w:rtl w:val="0"/>
+              </w:rPr>
+              <w:t xml:space="preserve">seats get unexpectedly locked or conflict during checkout, causing payment failures and lost bookings </w:t>
+            </w:r>
+          </w:p>
+        </w:tc>
+        <w:tc>
+          <w:tcPr/>
+          <w:p>
+            <w:pPr>
+              <w:rPr>
+                <w:rFonts w:ascii="Calibri" w:cs="Calibri" w:eastAsia="Calibri" w:hAnsi="Calibri"/>
+                <w:sz w:val="24"/>
+                <w:szCs w:val="24"/>
+              </w:rPr>
+            </w:pPr>
+            <w:r>
+              <w:rPr>
+                <w:rFonts w:ascii="Calibri" w:cs="Calibri" w:eastAsia="Calibri" w:hAnsi="Calibri"/>
+                <w:sz w:val="24"/>
+                <w:szCs w:val="24"/>
+                <w:rtl w:val="0"/>
+              </w:rPr>
+              <w:t xml:space="preserve"> traditional ticketing portals lack instantaneous live WebSocket seat synchronization during high-traffic rushes</w:t>
+            </w:r>
+          </w:p>
+        </w:tc>
+        <w:tc>
+          <w:tcPr/>
+          <w:p>
+            <w:pPr>
+              <w:rPr>
+                <w:rFonts w:ascii="Calibri" w:cs="Calibri" w:eastAsia="Calibri" w:hAnsi="Calibri"/>
+                <w:sz w:val="24"/>
+                <w:szCs w:val="24"/>
+              </w:rPr>
+            </w:pPr>
+            <w:r>
+              <w:rPr>
+                <w:rFonts w:ascii="Calibri" w:cs="Calibri" w:eastAsia="Calibri" w:hAnsi="Calibri"/>
+                <w:sz w:val="24"/>
+                <w:szCs w:val="24"/>
+                <w:rtl w:val="0"/>
+              </w:rPr>
+              <w:t xml:space="preserve">deeply frustrated by lost seats and forced to settle for separated or front-row seats.</w:t>
             </w:r>
           </w:p>
         </w:tc>
@@ -815,49 +813,49 @@
                 <w:szCs w:val="24"/>
                 <w:rtl w:val="0"/>
               </w:rPr>
-              <w:t xml:space="preserve">freelance graphic designer</w:t>
-            </w:r>
-          </w:p>
-        </w:tc>
-        <w:tc>
-          <w:tcPr/>
-          <w:p>
-            <w:pPr>
-              <w:rPr>
-                <w:rFonts w:ascii="Calibri" w:cs="Calibri" w:eastAsia="Calibri" w:hAnsi="Calibri"/>
-                <w:sz w:val="24"/>
-                <w:szCs w:val="24"/>
-              </w:rPr>
-            </w:pPr>
-            <w:r>
-              <w:rPr>
-                <w:rFonts w:ascii="Calibri" w:cs="Calibri" w:eastAsia="Calibri" w:hAnsi="Calibri"/>
-                <w:sz w:val="24"/>
-                <w:szCs w:val="24"/>
-                <w:rtl w:val="0"/>
-              </w:rPr>
-              <w:t xml:space="preserve">showcase my portfolio to potential clients effectively,</w:t>
-            </w:r>
-          </w:p>
-        </w:tc>
-        <w:tc>
-          <w:tcPr/>
-          <w:p>
-            <w:pPr>
-              <w:rPr>
-                <w:rFonts w:ascii="Calibri" w:cs="Calibri" w:eastAsia="Calibri" w:hAnsi="Calibri"/>
-                <w:sz w:val="24"/>
-                <w:szCs w:val="24"/>
-              </w:rPr>
-            </w:pPr>
-            <w:r>
-              <w:rPr>
-                <w:rFonts w:ascii="Calibri" w:cs="Calibri" w:eastAsia="Calibri" w:hAnsi="Calibri"/>
-                <w:sz w:val="24"/>
-                <w:szCs w:val="24"/>
-                <w:rtl w:val="0"/>
-              </w:rPr>
-              <w:t xml:space="preserve">platform limits personal branding tools</w:t>
+              <w:t xml:space="preserve">Working professional planning family cinema outings.</w:t>
+            </w:r>
+          </w:p>
+        </w:tc>
+        <w:tc>
+          <w:tcPr/>
+          <w:p>
+            <w:pPr>
+              <w:rPr>
+                <w:rFonts w:ascii="Calibri" w:cs="Calibri" w:eastAsia="Calibri" w:hAnsi="Calibri"/>
+                <w:sz w:val="24"/>
+                <w:szCs w:val="24"/>
+              </w:rPr>
+            </w:pPr>
+            <w:r>
+              <w:rPr>
+                <w:rFonts w:ascii="Calibri" w:cs="Calibri" w:eastAsia="Calibri" w:hAnsi="Calibri"/>
+                <w:sz w:val="24"/>
+                <w:szCs w:val="24"/>
+                <w:rtl w:val="0"/>
+              </w:rPr>
+              <w:t xml:space="preserve">quickly discover high-rated movies nearby, preview official trailers, and select convenient showtimes,</w:t>
+            </w:r>
+          </w:p>
+        </w:tc>
+        <w:tc>
+          <w:tcPr/>
+          <w:p>
+            <w:pPr>
+              <w:rPr>
+                <w:rFonts w:ascii="Calibri" w:cs="Calibri" w:eastAsia="Calibri" w:hAnsi="Calibri"/>
+                <w:sz w:val="24"/>
+                <w:szCs w:val="24"/>
+              </w:rPr>
+            </w:pPr>
+            <w:r>
+              <w:rPr>
+                <w:rFonts w:ascii="Calibri" w:cs="Calibri" w:eastAsia="Calibri" w:hAnsi="Calibri"/>
+                <w:sz w:val="24"/>
+                <w:szCs w:val="24"/>
+                <w:rtl w:val="0"/>
+              </w:rPr>
+              <w:t xml:space="preserve">existing ticketing apps have cluttered, ad-heavy interfaces with broken trailer links and no curated guidance</w:t>
             </w:r>
           </w:p>
         </w:tc>
@@ -896,7 +894,7 @@
                 <w:szCs w:val="24"/>
                 <w:rtl w:val="0"/>
               </w:rPr>
-              <w:t xml:space="preserve"> I can't stand out or grow my career.</w:t>
+              <w:t xml:space="preserve"> I spend over 20 minutes jumping between apps and often pick disappointing movies.</w:t>
             </w:r>
           </w:p>
         </w:tc>

</xml_diff>